<commit_message>
Atualizando a pasta que tem os arquivos do segundo semestre
</commit_message>
<xml_diff>
--- a/Documentos-PI/2 Semestre/Entrega Final PI.docx
+++ b/Documentos-PI/2 Semestre/Entrega Final PI.docx
@@ -77,24 +77,6 @@
     </w:p>
     <w:p>
       <w:pPr>
-        <w:spacing w:line="360" w:lineRule="auto"/>
-        <w:rPr>
-          <w:rFonts w:ascii="Arial" w:hAnsi="Arial"/>
-          <w:sz w:val="24"/>
-          <w:szCs w:val="24"/>
-        </w:rPr>
-      </w:pPr>
-      <w:r>
-        <w:rPr>
-          <w:rFonts w:ascii="Arial" w:hAnsi="Arial"/>
-          <w:sz w:val="24"/>
-          <w:szCs w:val="24"/>
-        </w:rPr>
-        <w:t>Ver a questão do thiago</w:t>
-      </w:r>
-    </w:p>
-    <w:p>
-      <w:pPr>
         <w:pStyle w:val="PargrafodaLista"/>
         <w:numPr>
           <w:ilvl w:val="0"/>
@@ -132,8 +114,19 @@
           <w:sz w:val="24"/>
           <w:szCs w:val="24"/>
         </w:rPr>
-        <w:t>video sem tempo</w:t>
-      </w:r>
+        <w:t xml:space="preserve">Link do video: </w:t>
+      </w:r>
+      <w:hyperlink r:id="rId6" w:history="1">
+        <w:r>
+          <w:rPr>
+            <w:rStyle w:val="Hiperligao"/>
+            <w:rFonts w:ascii="Arial" w:hAnsi="Arial"/>
+            <w:sz w:val="24"/>
+            <w:szCs w:val="24"/>
+          </w:rPr>
+          <w:t>https://www.youtube.com/watch?v=SbiXdH6MvnI</w:t>
+        </w:r>
+      </w:hyperlink>
     </w:p>
     <w:p>
       <w:pPr>
@@ -218,7 +211,7 @@
         </w:rPr>
         <w:t xml:space="preserve">Duração de 5 minutos: </w:t>
       </w:r>
-      <w:hyperlink r:id="rId6" w:history="1">
+      <w:hyperlink r:id="rId7" w:history="1">
         <w:r>
           <w:rPr>
             <w:rStyle w:val="Hiperligao"/>
@@ -229,32 +222,43 @@
           <w:t>https://youtu.be/x66Qoki6pug</w:t>
         </w:r>
       </w:hyperlink>
-      <w:r>
-        <w:rPr>
-          <w:rFonts w:ascii="Arial" w:hAnsi="Arial"/>
-          <w:sz w:val="24"/>
-          <w:szCs w:val="24"/>
-        </w:rPr>
-        <w:t xml:space="preserve">  </w:t>
-      </w:r>
-    </w:p>
-    <w:p>
-      <w:pPr>
-        <w:spacing w:line="360" w:lineRule="auto"/>
-        <w:rPr>
-          <w:rFonts w:ascii="Arial" w:hAnsi="Arial"/>
-          <w:sz w:val="24"/>
-          <w:szCs w:val="24"/>
-        </w:rPr>
-      </w:pPr>
-      <w:r>
-        <w:rPr>
-          <w:rFonts w:ascii="Arial" w:hAnsi="Arial"/>
-          <w:sz w:val="24"/>
-          <w:szCs w:val="24"/>
-        </w:rPr>
-        <w:t xml:space="preserve">Sem limite de tempo: </w:t>
-      </w:r>
+    </w:p>
+    <w:p>
+      <w:pPr>
+        <w:spacing w:line="360" w:lineRule="auto"/>
+        <w:rPr>
+          <w:rFonts w:ascii="Arial" w:hAnsi="Arial"/>
+          <w:sz w:val="24"/>
+          <w:szCs w:val="24"/>
+        </w:rPr>
+      </w:pPr>
+      <w:r>
+        <w:rPr>
+          <w:rFonts w:ascii="Arial" w:hAnsi="Arial"/>
+          <w:sz w:val="24"/>
+          <w:szCs w:val="24"/>
+        </w:rPr>
+        <w:t>Sem limite de tempo:</w:t>
+      </w:r>
+      <w:r>
+        <w:rPr>
+          <w:rFonts w:ascii="Arial" w:hAnsi="Arial"/>
+          <w:sz w:val="24"/>
+          <w:szCs w:val="24"/>
+        </w:rPr>
+        <w:t xml:space="preserve"> </w:t>
+      </w:r>
+      <w:hyperlink r:id="rId8" w:history="1">
+        <w:r>
+          <w:rPr>
+            <w:rStyle w:val="Hiperligao"/>
+            <w:rFonts w:ascii="Arial" w:hAnsi="Arial"/>
+            <w:sz w:val="24"/>
+            <w:szCs w:val="24"/>
+          </w:rPr>
+          <w:t>https://www.youtube.com/watch?v=SbiXdH6MvnI</w:t>
+        </w:r>
+      </w:hyperlink>
     </w:p>
     <w:p>
       <w:pPr>
@@ -283,7 +287,7 @@
           <w:szCs w:val="24"/>
         </w:rPr>
       </w:pPr>
-      <w:hyperlink r:id="rId7" w:history="1">
+      <w:hyperlink r:id="rId9" w:history="1">
         <w:r>
           <w:rPr>
             <w:rStyle w:val="Hiperligao"/>
@@ -310,7 +314,6 @@
           <w:sz w:val="24"/>
           <w:szCs w:val="24"/>
         </w:rPr>
-        <w:lastRenderedPageBreak/>
         <w:t>Link do projeto do 1º Semestre</w:t>
       </w:r>
     </w:p>
@@ -323,7 +326,7 @@
           <w:szCs w:val="24"/>
         </w:rPr>
       </w:pPr>
-      <w:hyperlink r:id="rId8" w:history="1">
+      <w:hyperlink r:id="rId10" w:history="1">
         <w:r>
           <w:rPr>
             <w:rStyle w:val="Hiperligao"/>
@@ -436,7 +439,7 @@
           <w:szCs w:val="24"/>
         </w:rPr>
       </w:pPr>
-      <w:hyperlink r:id="rId9" w:history="1">
+      <w:hyperlink r:id="rId11" w:history="1">
         <w:r>
           <w:rPr>
             <w:rStyle w:val="Hiperligao"/>
@@ -444,7 +447,7 @@
             <w:sz w:val="24"/>
             <w:szCs w:val="24"/>
           </w:rPr>
-          <w:t>https://github.com/gmti87/Fatec-PI-2Sem/tree/main</w:t>
+          <w:t>https://github.com/gmti87/Fatec-PI-2Sem/tree/main/Documentos-PI/2%20Semestre</w:t>
         </w:r>
       </w:hyperlink>
     </w:p>

</xml_diff>